<commit_message>
Use light gray table borders instead of default black in generated Word docs
Co-Authored-By: Claude Sonnet 5 <noreply@anthropic.com>
</commit_message>
<xml_diff>
--- a/BANG_MA_CAN_OWNER_DUYET.docx
+++ b/BANG_MA_CAN_OWNER_DUYET.docx
@@ -99,6 +99,14 @@
         <w:tblStyle w:val="TableGrid"/>
         <w:tblW w:type="auto" w:w="0"/>
         <w:tblLook w:firstColumn="1" w:firstRow="1" w:lastColumn="0" w:lastRow="0" w:noHBand="0" w:noVBand="1" w:val="04A0"/>
+        <w:tblBorders>
+          <w:top w:val="single" w:sz="4" w:space="0" w:color="BFBFBF"/>
+          <w:left w:val="single" w:sz="4" w:space="0" w:color="BFBFBF"/>
+          <w:bottom w:val="single" w:sz="4" w:space="0" w:color="BFBFBF"/>
+          <w:right w:val="single" w:sz="4" w:space="0" w:color="BFBFBF"/>
+          <w:insideH w:val="single" w:sz="4" w:space="0" w:color="BFBFBF"/>
+          <w:insideV w:val="single" w:sz="4" w:space="0" w:color="BFBFBF"/>
+        </w:tblBorders>
       </w:tblPr>
       <w:tblGrid>
         <w:gridCol w:w="2880"/>
@@ -2391,6 +2399,14 @@
         <w:tblStyle w:val="TableGrid"/>
         <w:tblW w:type="auto" w:w="0"/>
         <w:tblLook w:firstColumn="1" w:firstRow="1" w:lastColumn="0" w:lastRow="0" w:noHBand="0" w:noVBand="1" w:val="04A0"/>
+        <w:tblBorders>
+          <w:top w:val="single" w:sz="4" w:space="0" w:color="BFBFBF"/>
+          <w:left w:val="single" w:sz="4" w:space="0" w:color="BFBFBF"/>
+          <w:bottom w:val="single" w:sz="4" w:space="0" w:color="BFBFBF"/>
+          <w:right w:val="single" w:sz="4" w:space="0" w:color="BFBFBF"/>
+          <w:insideH w:val="single" w:sz="4" w:space="0" w:color="BFBFBF"/>
+          <w:insideV w:val="single" w:sz="4" w:space="0" w:color="BFBFBF"/>
+        </w:tblBorders>
       </w:tblPr>
       <w:tblGrid>
         <w:gridCol w:w="4320"/>

</xml_diff>